<commit_message>
Se sube el documento de evidencias del administrador, con el repositorio sin permisos de escritura en la rama principal.
</commit_message>
<xml_diff>
--- a/mudevops07_act1_GRUPAL - Evidencias.docx
+++ b/mudevops07_act1_GRUPAL - Evidencias.docx
@@ -780,10 +780,22 @@
         <w:t>Una vez inicializado el repositorio, el administrador compartirá la URL con el resto del grupo</w:t>
       </w:r>
       <w:r>
-        <w:t>, pero no</w:t>
-      </w:r>
-      <w:r>
-        <w:t xml:space="preserve"> debe dar acceso de escritura a nadie. </w:t>
+        <w:t xml:space="preserve">, </w:t>
+      </w:r>
+      <w:r>
+        <w:rPr>
+          <w:highlight w:val="yellow"/>
+        </w:rPr>
+        <w:t>pero no</w:t>
+      </w:r>
+      <w:r>
+        <w:rPr>
+          <w:highlight w:val="yellow"/>
+        </w:rPr>
+        <w:t xml:space="preserve"> debe dar acceso de escritura a nadie</w:t>
+      </w:r>
+      <w:r>
+        <w:t xml:space="preserve">. </w:t>
       </w:r>
       <w:r>
         <w:t xml:space="preserve">Los demás integrantes deberán </w:t>
@@ -3258,6 +3270,12 @@
           <w:ilvl w:val="0"/>
           <w:numId w:val="39"/>
         </w:numPr>
+        <w:rPr>
+          <w:rStyle w:val="Hyperlink"/>
+          <w:color w:val="333333"/>
+          <w:sz w:val="24"/>
+          <w:u w:val="none"/>
+        </w:rPr>
       </w:pPr>
       <w:hyperlink r:id="rId19" w:history="1">
         <w:r>
@@ -3276,8 +3294,199 @@
           <w:ilvl w:val="0"/>
           <w:numId w:val="0"/>
         </w:numPr>
-        <w:ind w:left="1004"/>
-      </w:pPr>
+        <w:ind w:left="284" w:hanging="284"/>
+        <w:rPr>
+          <w:rStyle w:val="Hyperlink"/>
+          <w:color w:val="auto"/>
+          <w:sz w:val="24"/>
+          <w:u w:val="none"/>
+        </w:rPr>
+      </w:pPr>
+    </w:p>
+    <w:p>
+      <w:pPr>
+        <w:pStyle w:val="Vietaprimernivel"/>
+        <w:numPr>
+          <w:ilvl w:val="0"/>
+          <w:numId w:val="0"/>
+        </w:numPr>
+        <w:ind w:left="284" w:hanging="284"/>
+        <w:rPr>
+          <w:rStyle w:val="Hyperlink"/>
+          <w:color w:val="auto"/>
+          <w:sz w:val="24"/>
+          <w:u w:val="none"/>
+        </w:rPr>
+      </w:pPr>
+    </w:p>
+    <w:p>
+      <w:pPr>
+        <w:pStyle w:val="Vietaprimernivel"/>
+        <w:numPr>
+          <w:ilvl w:val="0"/>
+          <w:numId w:val="0"/>
+        </w:numPr>
+        <w:ind w:left="284" w:hanging="284"/>
+        <w:rPr>
+          <w:rStyle w:val="Hyperlink"/>
+          <w:color w:val="auto"/>
+          <w:sz w:val="24"/>
+          <w:u w:val="none"/>
+        </w:rPr>
+      </w:pPr>
+    </w:p>
+    <w:p>
+      <w:pPr>
+        <w:pStyle w:val="Vietaprimernivel"/>
+        <w:numPr>
+          <w:ilvl w:val="0"/>
+          <w:numId w:val="0"/>
+        </w:numPr>
+        <w:ind w:left="284" w:hanging="284"/>
+        <w:rPr>
+          <w:rStyle w:val="Hyperlink"/>
+          <w:color w:val="auto"/>
+          <w:sz w:val="24"/>
+          <w:u w:val="none"/>
+        </w:rPr>
+      </w:pPr>
+    </w:p>
+    <w:p>
+      <w:pPr>
+        <w:pStyle w:val="Vietaprimernivel"/>
+        <w:numPr>
+          <w:ilvl w:val="0"/>
+          <w:numId w:val="0"/>
+        </w:numPr>
+        <w:ind w:left="284" w:hanging="284"/>
+        <w:rPr>
+          <w:rStyle w:val="Hyperlink"/>
+          <w:b/>
+          <w:bCs/>
+          <w:color w:val="auto"/>
+          <w:sz w:val="24"/>
+          <w:u w:val="none"/>
+        </w:rPr>
+      </w:pPr>
+      <w:r>
+        <w:rPr>
+          <w:rStyle w:val="Hyperlink"/>
+          <w:b/>
+          <w:bCs/>
+          <w:color w:val="auto"/>
+          <w:sz w:val="24"/>
+          <w:u w:val="none"/>
+        </w:rPr>
+        <w:lastRenderedPageBreak/>
+        <w:t>Repositorio sin permiso de escritura</w:t>
+      </w:r>
+    </w:p>
+    <w:p>
+      <w:pPr>
+        <w:pStyle w:val="Vietaprimernivel"/>
+        <w:numPr>
+          <w:ilvl w:val="0"/>
+          <w:numId w:val="0"/>
+        </w:numPr>
+        <w:ind w:left="284" w:hanging="284"/>
+        <w:rPr>
+          <w:color w:val="auto"/>
+        </w:rPr>
+      </w:pPr>
+      <w:r>
+        <w:rPr>
+          <w:noProof/>
+        </w:rPr>
+        <w:drawing>
+          <wp:anchor distT="0" distB="0" distL="114300" distR="114300" simplePos="0" relativeHeight="251658240" behindDoc="0" locked="0" layoutInCell="1" allowOverlap="1" wp14:anchorId="67A1646B" wp14:editId="39AABAF4">
+            <wp:simplePos x="0" y="0"/>
+            <wp:positionH relativeFrom="column">
+              <wp:posOffset>3175</wp:posOffset>
+            </wp:positionH>
+            <wp:positionV relativeFrom="paragraph">
+              <wp:posOffset>959485</wp:posOffset>
+            </wp:positionV>
+            <wp:extent cx="5219700" cy="3090545"/>
+            <wp:effectExtent l="0" t="0" r="0" b="0"/>
+            <wp:wrapNone/>
+            <wp:docPr id="516991892" name="Picture 1"/>
+            <wp:cNvGraphicFramePr>
+              <a:graphicFrameLocks xmlns:a="http://schemas.openxmlformats.org/drawingml/2006/main" noChangeAspect="1"/>
+            </wp:cNvGraphicFramePr>
+            <a:graphic xmlns:a="http://schemas.openxmlformats.org/drawingml/2006/main">
+              <a:graphicData uri="http://schemas.openxmlformats.org/drawingml/2006/picture">
+                <pic:pic xmlns:pic="http://schemas.openxmlformats.org/drawingml/2006/picture">
+                  <pic:nvPicPr>
+                    <pic:cNvPr id="516991892" name=""/>
+                    <pic:cNvPicPr/>
+                  </pic:nvPicPr>
+                  <pic:blipFill>
+                    <a:blip r:embed="rId20" cstate="print">
+                      <a:extLst>
+                        <a:ext uri="{28A0092B-C50C-407E-A947-70E740481C1C}">
+                          <a14:useLocalDpi xmlns:a14="http://schemas.microsoft.com/office/drawing/2010/main" val="0"/>
+                        </a:ext>
+                      </a:extLst>
+                    </a:blip>
+                    <a:stretch>
+                      <a:fillRect/>
+                    </a:stretch>
+                  </pic:blipFill>
+                  <pic:spPr>
+                    <a:xfrm>
+                      <a:off x="0" y="0"/>
+                      <a:ext cx="5219700" cy="3090545"/>
+                    </a:xfrm>
+                    <a:prstGeom prst="rect">
+                      <a:avLst/>
+                    </a:prstGeom>
+                  </pic:spPr>
+                </pic:pic>
+              </a:graphicData>
+            </a:graphic>
+          </wp:anchor>
+        </w:drawing>
+      </w:r>
+      <w:r>
+        <w:rPr>
+          <w:noProof/>
+        </w:rPr>
+        <w:drawing>
+          <wp:inline distT="0" distB="0" distL="0" distR="0" wp14:anchorId="2AE901C0" wp14:editId="286D03F7">
+            <wp:extent cx="5219700" cy="956310"/>
+            <wp:effectExtent l="0" t="0" r="0" b="0"/>
+            <wp:docPr id="1801279514" name="Picture 1"/>
+            <wp:cNvGraphicFramePr>
+              <a:graphicFrameLocks xmlns:a="http://schemas.openxmlformats.org/drawingml/2006/main" noChangeAspect="1"/>
+            </wp:cNvGraphicFramePr>
+            <a:graphic xmlns:a="http://schemas.openxmlformats.org/drawingml/2006/main">
+              <a:graphicData uri="http://schemas.openxmlformats.org/drawingml/2006/picture">
+                <pic:pic xmlns:pic="http://schemas.openxmlformats.org/drawingml/2006/picture">
+                  <pic:nvPicPr>
+                    <pic:cNvPr id="1801279514" name=""/>
+                    <pic:cNvPicPr/>
+                  </pic:nvPicPr>
+                  <pic:blipFill>
+                    <a:blip r:embed="rId21"/>
+                    <a:stretch>
+                      <a:fillRect/>
+                    </a:stretch>
+                  </pic:blipFill>
+                  <pic:spPr>
+                    <a:xfrm>
+                      <a:off x="0" y="0"/>
+                      <a:ext cx="5219700" cy="956310"/>
+                    </a:xfrm>
+                    <a:prstGeom prst="rect">
+                      <a:avLst/>
+                    </a:prstGeom>
+                  </pic:spPr>
+                </pic:pic>
+              </a:graphicData>
+            </a:graphic>
+          </wp:inline>
+        </w:drawing>
+      </w:r>
     </w:p>
     <w:p>
       <w:pPr>
@@ -3287,6 +3496,9 @@
           <w:numId w:val="0"/>
         </w:numPr>
         <w:ind w:left="1004"/>
+        <w:rPr>
+          <w:color w:val="auto"/>
+        </w:rPr>
       </w:pPr>
     </w:p>
     <w:p>
@@ -3297,6 +3509,105 @@
           <w:numId w:val="0"/>
         </w:numPr>
         <w:ind w:left="1004"/>
+        <w:rPr>
+          <w:color w:val="auto"/>
+        </w:rPr>
+      </w:pPr>
+    </w:p>
+    <w:p>
+      <w:pPr>
+        <w:pStyle w:val="Vietaprimernivel"/>
+        <w:numPr>
+          <w:ilvl w:val="0"/>
+          <w:numId w:val="0"/>
+        </w:numPr>
+        <w:ind w:left="1004"/>
+        <w:rPr>
+          <w:color w:val="auto"/>
+        </w:rPr>
+      </w:pPr>
+    </w:p>
+    <w:p>
+      <w:pPr>
+        <w:pStyle w:val="Vietaprimernivel"/>
+        <w:numPr>
+          <w:ilvl w:val="0"/>
+          <w:numId w:val="0"/>
+        </w:numPr>
+        <w:ind w:left="1004"/>
+        <w:rPr>
+          <w:color w:val="auto"/>
+        </w:rPr>
+      </w:pPr>
+    </w:p>
+    <w:p>
+      <w:pPr>
+        <w:pStyle w:val="Vietaprimernivel"/>
+        <w:numPr>
+          <w:ilvl w:val="0"/>
+          <w:numId w:val="0"/>
+        </w:numPr>
+        <w:ind w:left="1004"/>
+      </w:pPr>
+    </w:p>
+    <w:p>
+      <w:pPr>
+        <w:pStyle w:val="Vietaprimernivel"/>
+        <w:numPr>
+          <w:ilvl w:val="0"/>
+          <w:numId w:val="0"/>
+        </w:numPr>
+        <w:ind w:left="1004"/>
+      </w:pPr>
+    </w:p>
+    <w:p>
+      <w:pPr>
+        <w:pStyle w:val="Vietaprimernivel"/>
+        <w:numPr>
+          <w:ilvl w:val="0"/>
+          <w:numId w:val="0"/>
+        </w:numPr>
+        <w:ind w:left="1004"/>
+      </w:pPr>
+    </w:p>
+    <w:p>
+      <w:pPr>
+        <w:pStyle w:val="Vietaprimernivel"/>
+        <w:numPr>
+          <w:ilvl w:val="0"/>
+          <w:numId w:val="0"/>
+        </w:numPr>
+        <w:ind w:left="1004"/>
+      </w:pPr>
+    </w:p>
+    <w:p>
+      <w:pPr>
+        <w:pStyle w:val="Vietaprimernivel"/>
+        <w:numPr>
+          <w:ilvl w:val="0"/>
+          <w:numId w:val="0"/>
+        </w:numPr>
+        <w:ind w:left="1004"/>
+      </w:pPr>
+    </w:p>
+    <w:p>
+      <w:pPr>
+        <w:pStyle w:val="Vietaprimernivel"/>
+        <w:numPr>
+          <w:ilvl w:val="0"/>
+          <w:numId w:val="0"/>
+        </w:numPr>
+        <w:ind w:left="1004"/>
+      </w:pPr>
+    </w:p>
+    <w:p>
+      <w:pPr>
+        <w:pStyle w:val="Vietaprimernivel"/>
+        <w:numPr>
+          <w:ilvl w:val="0"/>
+          <w:numId w:val="0"/>
+        </w:numPr>
+        <w:ind w:left="1004"/>
       </w:pPr>
     </w:p>
     <w:p>
@@ -3314,7 +3625,6 @@
         <w:pStyle w:val="Vietaprimernivel"/>
       </w:pPr>
       <w:r>
-        <w:lastRenderedPageBreak/>
         <w:t xml:space="preserve">El </w:t>
       </w:r>
       <w:proofErr w:type="spellStart"/>
@@ -3677,6 +3987,7 @@
         <w:pStyle w:val="TtuloApartado3"/>
       </w:pPr>
       <w:r>
+        <w:lastRenderedPageBreak/>
         <w:t>Rúbrica</w:t>
       </w:r>
     </w:p>
@@ -4654,8 +4965,8 @@
       </w:pPr>
     </w:p>
     <w:sectPr>
-      <w:headerReference w:type="default" r:id="rId20"/>
-      <w:footerReference w:type="default" r:id="rId21"/>
+      <w:headerReference w:type="default" r:id="rId22"/>
+      <w:footerReference w:type="default" r:id="rId23"/>
       <w:pgSz w:w="11906" w:h="16838" w:code="9"/>
       <w:pgMar w:top="1418" w:right="1843" w:bottom="1418" w:left="1843" w:header="1134" w:footer="397" w:gutter="0"/>
       <w:cols w:space="708"/>
@@ -9707,10 +10018,6 @@
 </file>
 
 <file path=customXml/item1.xml><?xml version="1.0" encoding="utf-8"?>
-<b:Sources xmlns:b="http://schemas.openxmlformats.org/officeDocument/2006/bibliography" xmlns="http://schemas.openxmlformats.org/officeDocument/2006/bibliography" SelectedStyle="\APASixthEditionOfficeOnline.xsl" StyleName="APA" Version="6"/>
-</file>
-
-<file path=customXml/item2.xml><?xml version="1.0" encoding="utf-8"?>
 <p:properties xmlns:p="http://schemas.microsoft.com/office/2006/metadata/properties" xmlns:xsi="http://www.w3.org/2001/XMLSchema-instance" xmlns:pc="http://schemas.microsoft.com/office/infopath/2007/PartnerControls">
   <documentManagement>
     <lcf76f155ced4ddcb4097134ff3c332f xmlns="27c1adeb-3674-457c-b08c-8a73f31b6e23">
@@ -9722,7 +10029,20 @@
 </p:properties>
 </file>
 
+<file path=customXml/item2.xml><?xml version="1.0" encoding="utf-8"?>
+<b:Sources xmlns:b="http://schemas.openxmlformats.org/officeDocument/2006/bibliography" xmlns="http://schemas.openxmlformats.org/officeDocument/2006/bibliography" SelectedStyle="\APASixthEditionOfficeOnline.xsl" StyleName="APA" Version="6"/>
+</file>
+
 <file path=customXml/item3.xml><?xml version="1.0" encoding="utf-8"?>
+<?mso-contentType ?>
+<FormTemplates xmlns="http://schemas.microsoft.com/sharepoint/v3/contenttype/forms">
+  <Display>DocumentLibraryForm</Display>
+  <Edit>DocumentLibraryForm</Edit>
+  <New>DocumentLibraryForm</New>
+</FormTemplates>
+</file>
+
+<file path=customXml/item4.xml><?xml version="1.0" encoding="utf-8"?>
 <ct:contentTypeSchema xmlns:ct="http://schemas.microsoft.com/office/2006/metadata/contentType" xmlns:ma="http://schemas.microsoft.com/office/2006/metadata/properties/metaAttributes" ct:_="" ma:_="" ma:contentTypeName="Documento" ma:contentTypeID="0x010100DF3D7C797EA12745A270EF30E38719B9" ma:contentTypeVersion="19" ma:contentTypeDescription="Crear nuevo documento." ma:contentTypeScope="" ma:versionID="9b3f85d10149739ebc40127471298f58">
   <xsd:schema xmlns:xsd="http://www.w3.org/2001/XMLSchema" xmlns:xs="http://www.w3.org/2001/XMLSchema" xmlns:p="http://schemas.microsoft.com/office/2006/metadata/properties" xmlns:ns2="0a70e875-3d35-4be2-921f-7117c31bab9b" xmlns:ns3="27c1adeb-3674-457c-b08c-8a73f31b6e23" targetNamespace="http://schemas.microsoft.com/office/2006/metadata/properties" ma:root="true" ma:fieldsID="0559bebde66b072b3ad70ef2676e7a86" ns2:_="" ns3:_="">
     <xsd:import namespace="0a70e875-3d35-4be2-921f-7117c31bab9b"/>
@@ -9983,24 +10303,7 @@
 </ct:contentTypeSchema>
 </file>
 
-<file path=customXml/item4.xml><?xml version="1.0" encoding="utf-8"?>
-<?mso-contentType ?>
-<FormTemplates xmlns="http://schemas.microsoft.com/sharepoint/v3/contenttype/forms">
-  <Display>DocumentLibraryForm</Display>
-  <Edit>DocumentLibraryForm</Edit>
-  <New>DocumentLibraryForm</New>
-</FormTemplates>
-</file>
-
 <file path=customXml/itemProps1.xml><?xml version="1.0" encoding="utf-8"?>
-<ds:datastoreItem xmlns:ds="http://schemas.openxmlformats.org/officeDocument/2006/customXml" ds:itemID="{68EF0881-AFE3-44EB-8834-1E31251C8A76}">
-  <ds:schemaRefs>
-    <ds:schemaRef ds:uri="http://schemas.openxmlformats.org/officeDocument/2006/bibliography"/>
-  </ds:schemaRefs>
-</ds:datastoreItem>
-</file>
-
-<file path=customXml/itemProps2.xml><?xml version="1.0" encoding="utf-8"?>
 <ds:datastoreItem xmlns:ds="http://schemas.openxmlformats.org/officeDocument/2006/customXml" ds:itemID="{5DA6F32C-6FAE-4705-8722-B42C5F1E24E2}">
   <ds:schemaRefs>
     <ds:schemaRef ds:uri="http://schemas.microsoft.com/office/2006/metadata/properties"/>
@@ -10011,7 +10314,23 @@
 </ds:datastoreItem>
 </file>
 
+<file path=customXml/itemProps2.xml><?xml version="1.0" encoding="utf-8"?>
+<ds:datastoreItem xmlns:ds="http://schemas.openxmlformats.org/officeDocument/2006/customXml" ds:itemID="{68EF0881-AFE3-44EB-8834-1E31251C8A76}">
+  <ds:schemaRefs>
+    <ds:schemaRef ds:uri="http://schemas.openxmlformats.org/officeDocument/2006/bibliography"/>
+  </ds:schemaRefs>
+</ds:datastoreItem>
+</file>
+
 <file path=customXml/itemProps3.xml><?xml version="1.0" encoding="utf-8"?>
+<ds:datastoreItem xmlns:ds="http://schemas.openxmlformats.org/officeDocument/2006/customXml" ds:itemID="{DADA22EA-30AF-48ED-8DC0-06AFFED52517}">
+  <ds:schemaRefs>
+    <ds:schemaRef ds:uri="http://schemas.microsoft.com/sharepoint/v3/contenttype/forms"/>
+  </ds:schemaRefs>
+</ds:datastoreItem>
+</file>
+
+<file path=customXml/itemProps4.xml><?xml version="1.0" encoding="utf-8"?>
 <ds:datastoreItem xmlns:ds="http://schemas.openxmlformats.org/officeDocument/2006/customXml" ds:itemID="{77FFC1A5-44DD-4B3F-AE9D-FA35F4DCEA49}">
   <ds:schemaRefs>
     <ds:schemaRef ds:uri="http://schemas.microsoft.com/office/2006/metadata/contentType"/>
@@ -10028,12 +10347,4 @@
     <ds:schemaRef ds:uri="http://schemas.microsoft.com/internal/obd"/>
   </ds:schemaRefs>
 </ds:datastoreItem>
-</file>
-
-<file path=customXml/itemProps4.xml><?xml version="1.0" encoding="utf-8"?>
-<ds:datastoreItem xmlns:ds="http://schemas.openxmlformats.org/officeDocument/2006/customXml" ds:itemID="{DADA22EA-30AF-48ED-8DC0-06AFFED52517}">
-  <ds:schemaRefs>
-    <ds:schemaRef ds:uri="http://schemas.microsoft.com/sharepoint/v3/contenttype/forms"/>
-  </ds:schemaRefs>
-</ds:datastoreItem>
 </file>
</xml_diff>